<commit_message>
Lab 1 complete (report)
</commit_message>
<xml_diff>
--- a/Computation math/Comp_lab_1/P3215 Выч Мат ЛР1 Линейский А.Е..docx
+++ b/Computation math/Comp_lab_1/P3215 Выч Мат ЛР1 Линейский А.Е..docx
@@ -351,10 +351,10 @@
         <w:t>6</w:t>
       </w:r>
     </w:p>
-    <w:bookmarkStart w:id="0" w:name="_Toc182062724" w:displacedByCustomXml="next"/>
-    <w:bookmarkStart w:id="1" w:name="_Toc178448935" w:displacedByCustomXml="next"/>
-    <w:bookmarkStart w:id="2" w:name="_Toc178448813" w:displacedByCustomXml="next"/>
-    <w:bookmarkStart w:id="3" w:name="_Toc178447396" w:displacedByCustomXml="next"/>
+    <w:bookmarkStart w:id="0" w:name="_Toc178447396" w:displacedByCustomXml="next"/>
+    <w:bookmarkStart w:id="1" w:name="_Toc178448813" w:displacedByCustomXml="next"/>
+    <w:bookmarkStart w:id="2" w:name="_Toc178448935" w:displacedByCustomXml="next"/>
+    <w:bookmarkStart w:id="3" w:name="_Toc182062724" w:displacedByCustomXml="next"/>
     <w:sdt>
       <w:sdtPr>
         <w:rPr>
@@ -609,87 +609,63 @@
               <w14:ligatures w14:val="standardContextual"/>
             </w:rPr>
           </w:pPr>
-          <w:r>
-            <w:fldChar w:fldCharType="begin"/>
-          </w:r>
-          <w:r>
-            <w:instrText>HYPERLINK \l "_Toc182062728"</w:instrText>
-          </w:r>
-          <w:r>
-            <w:fldChar w:fldCharType="separate"/>
-          </w:r>
-          <w:r>
-            <w:rPr>
-              <w:rStyle w:val="aa"/>
-              <w:noProof/>
-            </w:rPr>
-            <w:t>Результат работы</w:t>
-          </w:r>
-          <w:r>
-            <w:rPr>
-              <w:noProof/>
-              <w:webHidden/>
-            </w:rPr>
-            <w:tab/>
-          </w:r>
-          <w:r>
-            <w:rPr>
-              <w:noProof/>
-              <w:webHidden/>
-            </w:rPr>
-            <w:fldChar w:fldCharType="begin"/>
-          </w:r>
-          <w:r>
-            <w:rPr>
-              <w:noProof/>
-              <w:webHidden/>
-            </w:rPr>
-            <w:instrText xml:space="preserve"> PAGEREF _Toc182062728 \h </w:instrText>
-          </w:r>
-          <w:r>
-            <w:rPr>
-              <w:noProof/>
-              <w:webHidden/>
-            </w:rPr>
-          </w:r>
-          <w:r>
-            <w:rPr>
-              <w:noProof/>
-              <w:webHidden/>
-            </w:rPr>
-            <w:fldChar w:fldCharType="separate"/>
-          </w:r>
-          <w:ins w:id="4" w:author="Vasy Medov" w:date="2026-02-18T21:24:00Z">
+          <w:hyperlink w:anchor="_Toc182062728" w:history="1">
+            <w:r>
+              <w:rPr>
+                <w:rStyle w:val="aa"/>
+                <w:noProof/>
+              </w:rPr>
+              <w:t>Результат работы</w:t>
+            </w:r>
             <w:r>
               <w:rPr>
                 <w:noProof/>
                 <w:webHidden/>
               </w:rPr>
-              <w:t>5</w:t>
-            </w:r>
-          </w:ins>
-          <w:del w:id="5" w:author="Vasy Medov" w:date="2026-02-18T21:24:00Z">
+              <w:tab/>
+            </w:r>
             <w:r>
               <w:rPr>
                 <w:noProof/>
                 <w:webHidden/>
               </w:rPr>
-              <w:delText>4</w:delText>
-            </w:r>
-          </w:del>
-          <w:r>
-            <w:rPr>
-              <w:noProof/>
-              <w:webHidden/>
-            </w:rPr>
-            <w:fldChar w:fldCharType="end"/>
-          </w:r>
-          <w:r>
-            <w:rPr>
-              <w:noProof/>
-            </w:rPr>
-            <w:fldChar w:fldCharType="end"/>
-          </w:r>
+              <w:fldChar w:fldCharType="begin"/>
+            </w:r>
+            <w:r>
+              <w:rPr>
+                <w:noProof/>
+                <w:webHidden/>
+              </w:rPr>
+              <w:instrText xml:space="preserve"> PAGEREF _Toc182062728 \h </w:instrText>
+            </w:r>
+            <w:r>
+              <w:rPr>
+                <w:noProof/>
+                <w:webHidden/>
+              </w:rPr>
+            </w:r>
+            <w:r>
+              <w:rPr>
+                <w:noProof/>
+                <w:webHidden/>
+              </w:rPr>
+              <w:fldChar w:fldCharType="separate"/>
+            </w:r>
+            <w:r>
+              <w:rPr>
+                <w:noProof/>
+                <w:webHidden/>
+              </w:rPr>
+              <w:t>6</w:t>
+            </w:r>
+            <w:r>
+              <w:rPr>
+                <w:noProof/>
+                <w:webHidden/>
+              </w:rPr>
+              <w:fldChar w:fldCharType="end"/>
+            </w:r>
+          </w:hyperlink>
         </w:p>
         <w:p>
           <w:pPr>
@@ -750,7 +726,7 @@
                 <w:noProof/>
                 <w:webHidden/>
               </w:rPr>
-              <w:t>5</w:t>
+              <w:t>6</w:t>
             </w:r>
             <w:r>
               <w:rPr>
@@ -1301,12 +1277,1339 @@
     <w:p>
       <w:pPr>
         <w:pStyle w:val="10"/>
-      </w:pPr>
-      <w:bookmarkStart w:id="6" w:name="_Toc182062727"/>
+        <w:rPr>
+          <w:ins w:id="4" w:author="Vasy Medov" w:date="2026-02-19T17:43:00Z"/>
+          <w:rPrChange w:id="5" w:author="Vasy Medov" w:date="2026-02-19T17:43:00Z">
+            <w:rPr>
+              <w:ins w:id="6" w:author="Vasy Medov" w:date="2026-02-19T17:43:00Z"/>
+              <w:lang w:val="en-US"/>
+            </w:rPr>
+          </w:rPrChange>
+        </w:rPr>
+      </w:pPr>
+      <w:bookmarkStart w:id="7" w:name="_Toc182062727"/>
       <w:r>
         <w:t>Исходный код программы</w:t>
       </w:r>
-      <w:bookmarkEnd w:id="6"/>
+      <w:bookmarkEnd w:id="7"/>
+    </w:p>
+    <w:tbl>
+      <w:tblPr>
+        <w:tblStyle w:val="ab"/>
+        <w:tblW w:w="0" w:type="auto"/>
+        <w:tblLook w:val="04A0" w:firstRow="1" w:lastRow="0" w:firstColumn="1" w:lastColumn="0" w:noHBand="0" w:noVBand="1"/>
+      </w:tblPr>
+      <w:tblGrid>
+        <w:gridCol w:w="9344"/>
+      </w:tblGrid>
+      <w:tr>
+        <w:tc>
+          <w:tcPr>
+            <w:tcW w:w="9344" w:type="dxa"/>
+          </w:tcPr>
+          <w:p>
+            <w:pPr>
+              <w:pStyle w:val="af2"/>
+              <w:rPr>
+                <w:lang w:val="ru-RU"/>
+              </w:rPr>
+            </w:pPr>
+          </w:p>
+          <w:p>
+            <w:pPr>
+              <w:pStyle w:val="af2"/>
+            </w:pPr>
+            <w:r>
+              <w:t xml:space="preserve">def </w:t>
+            </w:r>
+            <w:proofErr w:type="spellStart"/>
+            <w:r>
+              <w:t>calc_gauss_</w:t>
+            </w:r>
+            <w:proofErr w:type="gramStart"/>
+            <w:r>
+              <w:t>seidel</w:t>
+            </w:r>
+            <w:proofErr w:type="spellEnd"/>
+            <w:r>
+              <w:t>(</w:t>
+            </w:r>
+            <w:proofErr w:type="gramEnd"/>
+            <w:r>
+              <w:t>A, X, B, m=10, e=1e-2):</w:t>
+            </w:r>
+          </w:p>
+          <w:p>
+            <w:pPr>
+              <w:pStyle w:val="af2"/>
+              <w:rPr>
+                <w:lang w:val="ru-RU"/>
+              </w:rPr>
+            </w:pPr>
+            <w:r>
+              <w:t xml:space="preserve">    </w:t>
+            </w:r>
+            <w:r>
+              <w:rPr>
+                <w:lang w:val="ru-RU"/>
+              </w:rPr>
+              <w:t>"""Решение СЛАУ Методом Гаусса-Зейделя</w:t>
+            </w:r>
+          </w:p>
+          <w:p>
+            <w:pPr>
+              <w:pStyle w:val="af2"/>
+              <w:rPr>
+                <w:lang w:val="ru-RU"/>
+              </w:rPr>
+            </w:pPr>
+          </w:p>
+          <w:p>
+            <w:pPr>
+              <w:pStyle w:val="af2"/>
+              <w:rPr>
+                <w:lang w:val="ru-RU"/>
+              </w:rPr>
+            </w:pPr>
+            <w:r>
+              <w:t> </w:t>
+            </w:r>
+            <w:r>
+              <w:rPr>
+                <w:lang w:val="ru-RU"/>
+              </w:rPr>
+              <w:t xml:space="preserve"> </w:t>
+            </w:r>
+            <w:r>
+              <w:t> </w:t>
+            </w:r>
+            <w:r>
+              <w:rPr>
+                <w:lang w:val="ru-RU"/>
+              </w:rPr>
+              <w:t xml:space="preserve"> </w:t>
+            </w:r>
+            <w:proofErr w:type="spellStart"/>
+            <w:r>
+              <w:t>Args</w:t>
+            </w:r>
+            <w:proofErr w:type="spellEnd"/>
+            <w:r>
+              <w:rPr>
+                <w:lang w:val="ru-RU"/>
+              </w:rPr>
+              <w:t>:</w:t>
+            </w:r>
+          </w:p>
+          <w:p>
+            <w:pPr>
+              <w:pStyle w:val="af2"/>
+              <w:rPr>
+                <w:lang w:val="ru-RU"/>
+              </w:rPr>
+            </w:pPr>
+            <w:r>
+              <w:t> </w:t>
+            </w:r>
+            <w:r>
+              <w:rPr>
+                <w:lang w:val="ru-RU"/>
+              </w:rPr>
+              <w:t xml:space="preserve"> </w:t>
+            </w:r>
+            <w:r>
+              <w:t> </w:t>
+            </w:r>
+            <w:r>
+              <w:rPr>
+                <w:lang w:val="ru-RU"/>
+              </w:rPr>
+              <w:t xml:space="preserve"> </w:t>
+            </w:r>
+            <w:r>
+              <w:t> </w:t>
+            </w:r>
+            <w:r>
+              <w:rPr>
+                <w:lang w:val="ru-RU"/>
+              </w:rPr>
+              <w:t xml:space="preserve"> </w:t>
+            </w:r>
+            <w:r>
+              <w:t> </w:t>
+            </w:r>
+            <w:r>
+              <w:rPr>
+                <w:lang w:val="ru-RU"/>
+              </w:rPr>
+              <w:t xml:space="preserve"> </w:t>
+            </w:r>
+            <w:r>
+              <w:t>A</w:t>
+            </w:r>
+            <w:r>
+              <w:rPr>
+                <w:lang w:val="ru-RU"/>
+              </w:rPr>
+              <w:t xml:space="preserve"> (</w:t>
+            </w:r>
+            <w:r>
+              <w:t>float</w:t>
+            </w:r>
+            <w:r>
+              <w:rPr>
+                <w:lang w:val="ru-RU"/>
+              </w:rPr>
+              <w:t>): матрица коэффициентов</w:t>
+            </w:r>
+          </w:p>
+          <w:p>
+            <w:pPr>
+              <w:pStyle w:val="af2"/>
+              <w:rPr>
+                <w:lang w:val="ru-RU"/>
+              </w:rPr>
+            </w:pPr>
+            <w:r>
+              <w:t> </w:t>
+            </w:r>
+            <w:r>
+              <w:rPr>
+                <w:lang w:val="ru-RU"/>
+              </w:rPr>
+              <w:t xml:space="preserve"> </w:t>
+            </w:r>
+            <w:r>
+              <w:t> </w:t>
+            </w:r>
+            <w:r>
+              <w:rPr>
+                <w:lang w:val="ru-RU"/>
+              </w:rPr>
+              <w:t xml:space="preserve"> </w:t>
+            </w:r>
+            <w:r>
+              <w:t> </w:t>
+            </w:r>
+            <w:r>
+              <w:rPr>
+                <w:lang w:val="ru-RU"/>
+              </w:rPr>
+              <w:t xml:space="preserve"> </w:t>
+            </w:r>
+            <w:r>
+              <w:t> </w:t>
+            </w:r>
+            <w:r>
+              <w:rPr>
+                <w:lang w:val="ru-RU"/>
+              </w:rPr>
+              <w:t xml:space="preserve"> </w:t>
+            </w:r>
+            <w:r>
+              <w:t>X</w:t>
+            </w:r>
+            <w:r>
+              <w:rPr>
+                <w:lang w:val="ru-RU"/>
+              </w:rPr>
+              <w:t xml:space="preserve"> (</w:t>
+            </w:r>
+            <w:r>
+              <w:t>float</w:t>
+            </w:r>
+            <w:r>
+              <w:rPr>
+                <w:lang w:val="ru-RU"/>
+              </w:rPr>
+              <w:t>): матрица решений</w:t>
+            </w:r>
+          </w:p>
+          <w:p>
+            <w:pPr>
+              <w:pStyle w:val="af2"/>
+              <w:rPr>
+                <w:lang w:val="ru-RU"/>
+              </w:rPr>
+            </w:pPr>
+            <w:r>
+              <w:t> </w:t>
+            </w:r>
+            <w:r>
+              <w:rPr>
+                <w:lang w:val="ru-RU"/>
+              </w:rPr>
+              <w:t xml:space="preserve"> </w:t>
+            </w:r>
+            <w:r>
+              <w:t> </w:t>
+            </w:r>
+            <w:r>
+              <w:rPr>
+                <w:lang w:val="ru-RU"/>
+              </w:rPr>
+              <w:t xml:space="preserve"> </w:t>
+            </w:r>
+            <w:r>
+              <w:t> </w:t>
+            </w:r>
+            <w:r>
+              <w:rPr>
+                <w:lang w:val="ru-RU"/>
+              </w:rPr>
+              <w:t xml:space="preserve"> </w:t>
+            </w:r>
+            <w:r>
+              <w:t> </w:t>
+            </w:r>
+            <w:r>
+              <w:rPr>
+                <w:lang w:val="ru-RU"/>
+              </w:rPr>
+              <w:t xml:space="preserve"> </w:t>
+            </w:r>
+            <w:r>
+              <w:t>B</w:t>
+            </w:r>
+            <w:r>
+              <w:rPr>
+                <w:lang w:val="ru-RU"/>
+              </w:rPr>
+              <w:t xml:space="preserve"> (</w:t>
+            </w:r>
+            <w:r>
+              <w:t>float</w:t>
+            </w:r>
+            <w:r>
+              <w:rPr>
+                <w:lang w:val="ru-RU"/>
+              </w:rPr>
+              <w:t>): матрица свободных членов</w:t>
+            </w:r>
+          </w:p>
+          <w:p>
+            <w:pPr>
+              <w:pStyle w:val="af2"/>
+            </w:pPr>
+            <w:r>
+              <w:t> </w:t>
+            </w:r>
+            <w:r>
+              <w:rPr>
+                <w:lang w:val="ru-RU"/>
+              </w:rPr>
+              <w:t xml:space="preserve"> </w:t>
+            </w:r>
+            <w:r>
+              <w:t> </w:t>
+            </w:r>
+            <w:r>
+              <w:rPr>
+                <w:lang w:val="ru-RU"/>
+              </w:rPr>
+              <w:t xml:space="preserve"> </w:t>
+            </w:r>
+            <w:r>
+              <w:t> </w:t>
+            </w:r>
+            <w:r>
+              <w:rPr>
+                <w:lang w:val="ru-RU"/>
+              </w:rPr>
+              <w:t xml:space="preserve"> </w:t>
+            </w:r>
+            <w:r>
+              <w:t> </w:t>
+            </w:r>
+            <w:r>
+              <w:rPr>
+                <w:lang w:val="ru-RU"/>
+              </w:rPr>
+              <w:t xml:space="preserve"> </w:t>
+            </w:r>
+            <w:r>
+              <w:t>m</w:t>
+            </w:r>
+            <w:r>
+              <w:rPr>
+                <w:lang w:val="ru-RU"/>
+              </w:rPr>
+              <w:t xml:space="preserve"> (</w:t>
+            </w:r>
+            <w:r>
+              <w:t>int</w:t>
+            </w:r>
+            <w:r>
+              <w:rPr>
+                <w:lang w:val="ru-RU"/>
+              </w:rPr>
+              <w:t xml:space="preserve">, </w:t>
+            </w:r>
+            <w:r>
+              <w:t>optional</w:t>
+            </w:r>
+            <w:r>
+              <w:rPr>
+                <w:lang w:val="ru-RU"/>
+              </w:rPr>
+              <w:t xml:space="preserve">): макс. </w:t>
+            </w:r>
+            <w:proofErr w:type="spellStart"/>
+            <w:r>
+              <w:rPr>
+                <w:lang w:val="ru-RU"/>
+              </w:rPr>
+              <w:t>колическо</w:t>
+            </w:r>
+            <w:proofErr w:type="spellEnd"/>
+            <w:r>
+              <w:rPr>
+                <w:lang w:val="ru-RU"/>
+              </w:rPr>
+              <w:t xml:space="preserve"> итераций приближений. </w:t>
+            </w:r>
+            <w:r>
+              <w:t>Defaults to 10.</w:t>
+            </w:r>
+          </w:p>
+          <w:p>
+            <w:pPr>
+              <w:pStyle w:val="af2"/>
+            </w:pPr>
+            <w:r>
+              <w:t xml:space="preserve">        e (float, optional): </w:t>
+            </w:r>
+            <w:proofErr w:type="spellStart"/>
+            <w:r>
+              <w:t>допустимая</w:t>
+            </w:r>
+            <w:proofErr w:type="spellEnd"/>
+            <w:r>
+              <w:t xml:space="preserve"> </w:t>
+            </w:r>
+            <w:proofErr w:type="spellStart"/>
+            <w:r>
+              <w:t>погрешность</w:t>
+            </w:r>
+            <w:proofErr w:type="spellEnd"/>
+            <w:r>
+              <w:t>. Defaults to 1e-2.</w:t>
+            </w:r>
+          </w:p>
+          <w:p>
+            <w:pPr>
+              <w:pStyle w:val="af2"/>
+            </w:pPr>
+            <w:r>
+              <w:t>    """</w:t>
+            </w:r>
+          </w:p>
+          <w:p>
+            <w:pPr>
+              <w:pStyle w:val="af2"/>
+            </w:pPr>
+            <w:r>
+              <w:t xml:space="preserve">    </w:t>
+            </w:r>
+          </w:p>
+          <w:p>
+            <w:pPr>
+              <w:pStyle w:val="af2"/>
+            </w:pPr>
+            <w:r>
+              <w:t>    k=1</w:t>
+            </w:r>
+          </w:p>
+          <w:p>
+            <w:pPr>
+              <w:pStyle w:val="af2"/>
+            </w:pPr>
+            <w:r>
+              <w:t>    while 1:</w:t>
+            </w:r>
+          </w:p>
+          <w:p>
+            <w:pPr>
+              <w:pStyle w:val="af2"/>
+            </w:pPr>
+            <w:r>
+              <w:t>        delta = 0</w:t>
+            </w:r>
+          </w:p>
+          <w:p>
+            <w:pPr>
+              <w:pStyle w:val="af2"/>
+            </w:pPr>
+            <w:r>
+              <w:t xml:space="preserve">        for </w:t>
+            </w:r>
+            <w:proofErr w:type="spellStart"/>
+            <w:r>
+              <w:t>i</w:t>
+            </w:r>
+            <w:proofErr w:type="spellEnd"/>
+            <w:r>
+              <w:t xml:space="preserve"> in range(n):</w:t>
+            </w:r>
+          </w:p>
+          <w:p>
+            <w:pPr>
+              <w:pStyle w:val="af2"/>
+            </w:pPr>
+            <w:r>
+              <w:t>            s=0</w:t>
+            </w:r>
+          </w:p>
+          <w:p>
+            <w:pPr>
+              <w:pStyle w:val="af2"/>
+            </w:pPr>
+            <w:r>
+              <w:lastRenderedPageBreak/>
+              <w:t>            for j in range(</w:t>
+            </w:r>
+            <w:proofErr w:type="spellStart"/>
+            <w:r>
+              <w:t>i</w:t>
+            </w:r>
+            <w:proofErr w:type="spellEnd"/>
+            <w:r>
+              <w:t>):</w:t>
+            </w:r>
+          </w:p>
+          <w:p>
+            <w:pPr>
+              <w:pStyle w:val="af2"/>
+            </w:pPr>
+            <w:r>
+              <w:t xml:space="preserve">                s += </w:t>
+            </w:r>
+            <w:proofErr w:type="gramStart"/>
+            <w:r>
+              <w:t>A[</w:t>
+            </w:r>
+            <w:proofErr w:type="spellStart"/>
+            <w:proofErr w:type="gramEnd"/>
+            <w:r>
+              <w:t>i</w:t>
+            </w:r>
+            <w:proofErr w:type="spellEnd"/>
+            <w:r>
+              <w:t xml:space="preserve">, j] * X[j]   </w:t>
+            </w:r>
+          </w:p>
+          <w:p>
+            <w:pPr>
+              <w:pStyle w:val="af2"/>
+            </w:pPr>
+            <w:r>
+              <w:t xml:space="preserve">            for j in </w:t>
+            </w:r>
+            <w:proofErr w:type="gramStart"/>
+            <w:r>
+              <w:t>range(</w:t>
+            </w:r>
+            <w:proofErr w:type="gramEnd"/>
+            <w:r>
+              <w:t>i+1, n):</w:t>
+            </w:r>
+          </w:p>
+          <w:p>
+            <w:pPr>
+              <w:pStyle w:val="af2"/>
+            </w:pPr>
+            <w:r>
+              <w:t xml:space="preserve">                s += </w:t>
+            </w:r>
+            <w:proofErr w:type="gramStart"/>
+            <w:r>
+              <w:t>A[</w:t>
+            </w:r>
+            <w:proofErr w:type="spellStart"/>
+            <w:proofErr w:type="gramEnd"/>
+            <w:r>
+              <w:t>i</w:t>
+            </w:r>
+            <w:proofErr w:type="spellEnd"/>
+            <w:r>
+              <w:t>, j] * X[j]</w:t>
+            </w:r>
+          </w:p>
+          <w:p>
+            <w:pPr>
+              <w:pStyle w:val="af2"/>
+            </w:pPr>
+            <w:r>
+              <w:t xml:space="preserve">                </w:t>
+            </w:r>
+          </w:p>
+          <w:p>
+            <w:pPr>
+              <w:pStyle w:val="af2"/>
+            </w:pPr>
+            <w:r>
+              <w:t xml:space="preserve">            </w:t>
+            </w:r>
+            <w:proofErr w:type="spellStart"/>
+            <w:r>
+              <w:t>new_x</w:t>
+            </w:r>
+            <w:proofErr w:type="spellEnd"/>
+            <w:r>
+              <w:t xml:space="preserve"> = (B[</w:t>
+            </w:r>
+            <w:proofErr w:type="spellStart"/>
+            <w:r>
+              <w:t>i</w:t>
+            </w:r>
+            <w:proofErr w:type="spellEnd"/>
+            <w:r>
+              <w:t xml:space="preserve">] - s) / </w:t>
+            </w:r>
+            <w:proofErr w:type="gramStart"/>
+            <w:r>
+              <w:t>A[</w:t>
+            </w:r>
+            <w:proofErr w:type="spellStart"/>
+            <w:proofErr w:type="gramEnd"/>
+            <w:r>
+              <w:t>i</w:t>
+            </w:r>
+            <w:proofErr w:type="spellEnd"/>
+            <w:r>
+              <w:t xml:space="preserve">, </w:t>
+            </w:r>
+            <w:proofErr w:type="spellStart"/>
+            <w:r>
+              <w:t>i</w:t>
+            </w:r>
+            <w:proofErr w:type="spellEnd"/>
+            <w:r>
+              <w:t>]</w:t>
+            </w:r>
+          </w:p>
+          <w:p>
+            <w:pPr>
+              <w:pStyle w:val="af2"/>
+            </w:pPr>
+            <w:r>
+              <w:t xml:space="preserve">            </w:t>
+            </w:r>
+          </w:p>
+          <w:p>
+            <w:pPr>
+              <w:pStyle w:val="af2"/>
+            </w:pPr>
+            <w:r>
+              <w:t xml:space="preserve">            d = </w:t>
+            </w:r>
+            <w:proofErr w:type="gramStart"/>
+            <w:r>
+              <w:t>abs(</w:t>
+            </w:r>
+            <w:proofErr w:type="spellStart"/>
+            <w:proofErr w:type="gramEnd"/>
+            <w:r>
+              <w:t>new_x</w:t>
+            </w:r>
+            <w:proofErr w:type="spellEnd"/>
+            <w:r>
+              <w:t xml:space="preserve"> - X[</w:t>
+            </w:r>
+            <w:proofErr w:type="spellStart"/>
+            <w:r>
+              <w:t>i</w:t>
+            </w:r>
+            <w:proofErr w:type="spellEnd"/>
+            <w:r>
+              <w:t>])</w:t>
+            </w:r>
+          </w:p>
+          <w:p>
+            <w:pPr>
+              <w:pStyle w:val="af2"/>
+            </w:pPr>
+            <w:r>
+              <w:t>            if d &gt; delta:</w:t>
+            </w:r>
+          </w:p>
+          <w:p>
+            <w:pPr>
+              <w:pStyle w:val="af2"/>
+            </w:pPr>
+            <w:r>
+              <w:t>                delta = d</w:t>
+            </w:r>
+          </w:p>
+          <w:p>
+            <w:pPr>
+              <w:pStyle w:val="af2"/>
+            </w:pPr>
+            <w:r>
+              <w:t>            X[</w:t>
+            </w:r>
+            <w:proofErr w:type="spellStart"/>
+            <w:r>
+              <w:t>i</w:t>
+            </w:r>
+            <w:proofErr w:type="spellEnd"/>
+            <w:r>
+              <w:t xml:space="preserve">] = </w:t>
+            </w:r>
+            <w:proofErr w:type="spellStart"/>
+            <w:r>
+              <w:t>new_x</w:t>
+            </w:r>
+            <w:proofErr w:type="spellEnd"/>
+          </w:p>
+          <w:p>
+            <w:pPr>
+              <w:pStyle w:val="af2"/>
+            </w:pPr>
+          </w:p>
+          <w:p>
+            <w:pPr>
+              <w:pStyle w:val="af2"/>
+            </w:pPr>
+            <w:r>
+              <w:t xml:space="preserve">        </w:t>
+            </w:r>
+            <w:proofErr w:type="gramStart"/>
+            <w:r>
+              <w:t>print(</w:t>
+            </w:r>
+            <w:proofErr w:type="spellStart"/>
+            <w:proofErr w:type="gramEnd"/>
+            <w:r>
+              <w:t>f"Итерация</w:t>
+            </w:r>
+            <w:proofErr w:type="spellEnd"/>
+            <w:r>
+              <w:t xml:space="preserve"> {k}:")</w:t>
+            </w:r>
+          </w:p>
+          <w:p>
+            <w:pPr>
+              <w:pStyle w:val="af2"/>
+            </w:pPr>
+            <w:r>
+              <w:t xml:space="preserve">        for </w:t>
+            </w:r>
+            <w:proofErr w:type="spellStart"/>
+            <w:r>
+              <w:t>i</w:t>
+            </w:r>
+            <w:proofErr w:type="spellEnd"/>
+            <w:r>
+              <w:t xml:space="preserve"> in range(n):</w:t>
+            </w:r>
+          </w:p>
+          <w:p>
+            <w:pPr>
+              <w:pStyle w:val="af2"/>
+            </w:pPr>
+            <w:r>
+              <w:t xml:space="preserve">            </w:t>
+            </w:r>
+            <w:proofErr w:type="gramStart"/>
+            <w:r>
+              <w:t>print(</w:t>
+            </w:r>
+            <w:proofErr w:type="gramEnd"/>
+            <w:r>
+              <w:t>f"    x{i+1} = {</w:t>
+            </w:r>
+            <w:proofErr w:type="spellStart"/>
+            <w:r>
+              <w:t>X.copy</w:t>
+            </w:r>
+            <w:proofErr w:type="spellEnd"/>
+            <w:r>
+              <w:t>()[</w:t>
+            </w:r>
+            <w:proofErr w:type="spellStart"/>
+            <w:r>
+              <w:t>i</w:t>
+            </w:r>
+            <w:proofErr w:type="spellEnd"/>
+            <w:r>
+              <w:t>]:.10f}")</w:t>
+            </w:r>
+          </w:p>
+          <w:p>
+            <w:pPr>
+              <w:pStyle w:val="af2"/>
+            </w:pPr>
+          </w:p>
+          <w:p>
+            <w:pPr>
+              <w:pStyle w:val="af2"/>
+              <w:rPr>
+                <w:lang w:val="ru-RU"/>
+              </w:rPr>
+            </w:pPr>
+            <w:r>
+              <w:t>        if</w:t>
+            </w:r>
+            <w:r>
+              <w:rPr>
+                <w:lang w:val="ru-RU"/>
+              </w:rPr>
+              <w:t xml:space="preserve"> </w:t>
+            </w:r>
+            <w:r>
+              <w:t>delta</w:t>
+            </w:r>
+            <w:r>
+              <w:rPr>
+                <w:lang w:val="ru-RU"/>
+              </w:rPr>
+              <w:t xml:space="preserve"> &lt; </w:t>
+            </w:r>
+            <w:r>
+              <w:t>e</w:t>
+            </w:r>
+            <w:r>
+              <w:rPr>
+                <w:lang w:val="ru-RU"/>
+              </w:rPr>
+              <w:t>:</w:t>
+            </w:r>
+          </w:p>
+          <w:p>
+            <w:pPr>
+              <w:pStyle w:val="af2"/>
+              <w:rPr>
+                <w:lang w:val="ru-RU"/>
+              </w:rPr>
+            </w:pPr>
+            <w:r>
+              <w:t> </w:t>
+            </w:r>
+            <w:r>
+              <w:rPr>
+                <w:lang w:val="ru-RU"/>
+              </w:rPr>
+              <w:t xml:space="preserve"> </w:t>
+            </w:r>
+            <w:r>
+              <w:t> </w:t>
+            </w:r>
+            <w:r>
+              <w:rPr>
+                <w:lang w:val="ru-RU"/>
+              </w:rPr>
+              <w:t xml:space="preserve"> </w:t>
+            </w:r>
+            <w:r>
+              <w:t> </w:t>
+            </w:r>
+            <w:r>
+              <w:rPr>
+                <w:lang w:val="ru-RU"/>
+              </w:rPr>
+              <w:t xml:space="preserve"> </w:t>
+            </w:r>
+            <w:r>
+              <w:t> </w:t>
+            </w:r>
+            <w:r>
+              <w:rPr>
+                <w:lang w:val="ru-RU"/>
+              </w:rPr>
+              <w:t xml:space="preserve"> </w:t>
+            </w:r>
+            <w:r>
+              <w:t> </w:t>
+            </w:r>
+            <w:r>
+              <w:rPr>
+                <w:lang w:val="ru-RU"/>
+              </w:rPr>
+              <w:t xml:space="preserve"> </w:t>
+            </w:r>
+            <w:r>
+              <w:t> </w:t>
+            </w:r>
+            <w:r>
+              <w:rPr>
+                <w:lang w:val="ru-RU"/>
+              </w:rPr>
+              <w:t xml:space="preserve"> </w:t>
+            </w:r>
+            <w:proofErr w:type="gramStart"/>
+            <w:r>
+              <w:t>print</w:t>
+            </w:r>
+            <w:r>
+              <w:rPr>
+                <w:lang w:val="ru-RU"/>
+              </w:rPr>
+              <w:t>(</w:t>
+            </w:r>
+            <w:proofErr w:type="gramEnd"/>
+            <w:r>
+              <w:t>f</w:t>
+            </w:r>
+            <w:r>
+              <w:rPr>
+                <w:lang w:val="ru-RU"/>
+              </w:rPr>
+              <w:t>"Решение найдено за {</w:t>
+            </w:r>
+            <w:r>
+              <w:t>k</w:t>
+            </w:r>
+            <w:r>
+              <w:rPr>
+                <w:lang w:val="ru-RU"/>
+              </w:rPr>
+              <w:t>} итераций:")</w:t>
+            </w:r>
+          </w:p>
+          <w:p>
+            <w:pPr>
+              <w:pStyle w:val="af2"/>
+            </w:pPr>
+            <w:r>
+              <w:t> </w:t>
+            </w:r>
+            <w:r>
+              <w:rPr>
+                <w:lang w:val="ru-RU"/>
+              </w:rPr>
+              <w:t xml:space="preserve"> </w:t>
+            </w:r>
+            <w:r>
+              <w:t> </w:t>
+            </w:r>
+            <w:r>
+              <w:rPr>
+                <w:lang w:val="ru-RU"/>
+              </w:rPr>
+              <w:t xml:space="preserve"> </w:t>
+            </w:r>
+            <w:r>
+              <w:t> </w:t>
+            </w:r>
+            <w:r>
+              <w:rPr>
+                <w:lang w:val="ru-RU"/>
+              </w:rPr>
+              <w:t xml:space="preserve"> </w:t>
+            </w:r>
+            <w:r>
+              <w:t> </w:t>
+            </w:r>
+            <w:r>
+              <w:rPr>
+                <w:lang w:val="ru-RU"/>
+              </w:rPr>
+              <w:t xml:space="preserve"> </w:t>
+            </w:r>
+            <w:r>
+              <w:t> </w:t>
+            </w:r>
+            <w:r>
+              <w:rPr>
+                <w:lang w:val="ru-RU"/>
+              </w:rPr>
+              <w:t xml:space="preserve"> </w:t>
+            </w:r>
+            <w:r>
+              <w:t> </w:t>
+            </w:r>
+            <w:r>
+              <w:rPr>
+                <w:lang w:val="ru-RU"/>
+              </w:rPr>
+              <w:t xml:space="preserve"> </w:t>
+            </w:r>
+            <w:proofErr w:type="gramStart"/>
+            <w:r>
+              <w:t>print(</w:t>
+            </w:r>
+            <w:proofErr w:type="gramEnd"/>
+            <w:r>
+              <w:t>"</w:t>
+            </w:r>
+            <w:proofErr w:type="spellStart"/>
+            <w:r>
+              <w:t>Вектор</w:t>
+            </w:r>
+            <w:proofErr w:type="spellEnd"/>
+            <w:r>
+              <w:t xml:space="preserve"> </w:t>
+            </w:r>
+            <w:proofErr w:type="spellStart"/>
+            <w:r>
+              <w:t>неизвестных</w:t>
+            </w:r>
+            <w:proofErr w:type="spellEnd"/>
+            <w:r>
+              <w:t>:")</w:t>
+            </w:r>
+          </w:p>
+          <w:p>
+            <w:pPr>
+              <w:pStyle w:val="af2"/>
+            </w:pPr>
+            <w:r>
+              <w:t xml:space="preserve">            for </w:t>
+            </w:r>
+            <w:proofErr w:type="spellStart"/>
+            <w:r>
+              <w:t>i</w:t>
+            </w:r>
+            <w:proofErr w:type="spellEnd"/>
+            <w:r>
+              <w:t xml:space="preserve"> in range(n):</w:t>
+            </w:r>
+          </w:p>
+          <w:p>
+            <w:pPr>
+              <w:pStyle w:val="af2"/>
+            </w:pPr>
+            <w:r>
+              <w:t>                print(</w:t>
+            </w:r>
+            <w:proofErr w:type="spellStart"/>
+            <w:r>
+              <w:t>f"x</w:t>
+            </w:r>
+            <w:proofErr w:type="spellEnd"/>
+            <w:r>
+              <w:t>{i+1} = {X[</w:t>
+            </w:r>
+            <w:proofErr w:type="spellStart"/>
+            <w:r>
+              <w:t>i</w:t>
+            </w:r>
+            <w:proofErr w:type="spellEnd"/>
+            <w:r>
+              <w:t>]:.10f}")</w:t>
+            </w:r>
+          </w:p>
+          <w:p>
+            <w:pPr>
+              <w:pStyle w:val="af2"/>
+            </w:pPr>
+            <w:r>
+              <w:t>            break</w:t>
+            </w:r>
+          </w:p>
+          <w:p>
+            <w:pPr>
+              <w:pStyle w:val="af2"/>
+            </w:pPr>
+            <w:r>
+              <w:t>        else:</w:t>
+            </w:r>
+          </w:p>
+          <w:p>
+            <w:pPr>
+              <w:pStyle w:val="af2"/>
+            </w:pPr>
+            <w:r>
+              <w:t>            if k &lt; m:</w:t>
+            </w:r>
+          </w:p>
+          <w:p>
+            <w:pPr>
+              <w:pStyle w:val="af2"/>
+              <w:rPr>
+                <w:lang w:val="ru-RU"/>
+              </w:rPr>
+            </w:pPr>
+            <w:r>
+              <w:t>                k</w:t>
+            </w:r>
+            <w:r>
+              <w:rPr>
+                <w:lang w:val="ru-RU"/>
+              </w:rPr>
+              <w:t xml:space="preserve"> = </w:t>
+            </w:r>
+            <w:r>
+              <w:t>k</w:t>
+            </w:r>
+            <w:r>
+              <w:rPr>
+                <w:lang w:val="ru-RU"/>
+              </w:rPr>
+              <w:t xml:space="preserve"> + 1</w:t>
+            </w:r>
+          </w:p>
+          <w:p>
+            <w:pPr>
+              <w:pStyle w:val="af2"/>
+              <w:rPr>
+                <w:lang w:val="ru-RU"/>
+              </w:rPr>
+            </w:pPr>
+            <w:r>
+              <w:t> </w:t>
+            </w:r>
+            <w:r>
+              <w:rPr>
+                <w:lang w:val="ru-RU"/>
+              </w:rPr>
+              <w:t xml:space="preserve"> </w:t>
+            </w:r>
+            <w:r>
+              <w:t> </w:t>
+            </w:r>
+            <w:r>
+              <w:rPr>
+                <w:lang w:val="ru-RU"/>
+              </w:rPr>
+              <w:t xml:space="preserve"> </w:t>
+            </w:r>
+            <w:r>
+              <w:t> </w:t>
+            </w:r>
+            <w:r>
+              <w:rPr>
+                <w:lang w:val="ru-RU"/>
+              </w:rPr>
+              <w:t xml:space="preserve"> </w:t>
+            </w:r>
+            <w:r>
+              <w:t> </w:t>
+            </w:r>
+            <w:r>
+              <w:rPr>
+                <w:lang w:val="ru-RU"/>
+              </w:rPr>
+              <w:t xml:space="preserve"> </w:t>
+            </w:r>
+            <w:r>
+              <w:t> </w:t>
+            </w:r>
+            <w:r>
+              <w:rPr>
+                <w:lang w:val="ru-RU"/>
+              </w:rPr>
+              <w:t xml:space="preserve"> </w:t>
+            </w:r>
+            <w:r>
+              <w:t> </w:t>
+            </w:r>
+            <w:r>
+              <w:rPr>
+                <w:lang w:val="ru-RU"/>
+              </w:rPr>
+              <w:t xml:space="preserve"> </w:t>
+            </w:r>
+            <w:r>
+              <w:t>else</w:t>
+            </w:r>
+            <w:r>
+              <w:rPr>
+                <w:lang w:val="ru-RU"/>
+              </w:rPr>
+              <w:t>:</w:t>
+            </w:r>
+          </w:p>
+          <w:p>
+            <w:pPr>
+              <w:pStyle w:val="af2"/>
+              <w:rPr>
+                <w:lang w:val="ru-RU"/>
+              </w:rPr>
+            </w:pPr>
+            <w:r>
+              <w:t> </w:t>
+            </w:r>
+            <w:r>
+              <w:rPr>
+                <w:lang w:val="ru-RU"/>
+              </w:rPr>
+              <w:t xml:space="preserve"> </w:t>
+            </w:r>
+            <w:r>
+              <w:t> </w:t>
+            </w:r>
+            <w:r>
+              <w:rPr>
+                <w:lang w:val="ru-RU"/>
+              </w:rPr>
+              <w:t xml:space="preserve"> </w:t>
+            </w:r>
+            <w:r>
+              <w:t> </w:t>
+            </w:r>
+            <w:r>
+              <w:rPr>
+                <w:lang w:val="ru-RU"/>
+              </w:rPr>
+              <w:t xml:space="preserve"> </w:t>
+            </w:r>
+            <w:r>
+              <w:t> </w:t>
+            </w:r>
+            <w:r>
+              <w:rPr>
+                <w:lang w:val="ru-RU"/>
+              </w:rPr>
+              <w:t xml:space="preserve"> </w:t>
+            </w:r>
+            <w:r>
+              <w:t> </w:t>
+            </w:r>
+            <w:r>
+              <w:rPr>
+                <w:lang w:val="ru-RU"/>
+              </w:rPr>
+              <w:t xml:space="preserve"> </w:t>
+            </w:r>
+            <w:r>
+              <w:t> </w:t>
+            </w:r>
+            <w:r>
+              <w:rPr>
+                <w:lang w:val="ru-RU"/>
+              </w:rPr>
+              <w:t xml:space="preserve"> </w:t>
+            </w:r>
+            <w:r>
+              <w:t> </w:t>
+            </w:r>
+            <w:r>
+              <w:rPr>
+                <w:lang w:val="ru-RU"/>
+              </w:rPr>
+              <w:t xml:space="preserve"> </w:t>
+            </w:r>
+            <w:r>
+              <w:t> </w:t>
+            </w:r>
+            <w:r>
+              <w:rPr>
+                <w:lang w:val="ru-RU"/>
+              </w:rPr>
+              <w:t xml:space="preserve"> </w:t>
+            </w:r>
+            <w:proofErr w:type="gramStart"/>
+            <w:r>
+              <w:t>print</w:t>
+            </w:r>
+            <w:r>
+              <w:rPr>
+                <w:lang w:val="ru-RU"/>
+              </w:rPr>
+              <w:t>(</w:t>
+            </w:r>
+            <w:proofErr w:type="gramEnd"/>
+            <w:r>
+              <w:rPr>
+                <w:lang w:val="ru-RU"/>
+              </w:rPr>
+              <w:t>"Итерации расходятся")</w:t>
+            </w:r>
+          </w:p>
+          <w:p>
+            <w:pPr>
+              <w:pStyle w:val="af2"/>
+            </w:pPr>
+            <w:r>
+              <w:t> </w:t>
+            </w:r>
+            <w:r>
+              <w:rPr>
+                <w:lang w:val="ru-RU"/>
+              </w:rPr>
+              <w:t xml:space="preserve"> </w:t>
+            </w:r>
+            <w:r>
+              <w:t> </w:t>
+            </w:r>
+            <w:r>
+              <w:rPr>
+                <w:lang w:val="ru-RU"/>
+              </w:rPr>
+              <w:t xml:space="preserve"> </w:t>
+            </w:r>
+            <w:r>
+              <w:t> </w:t>
+            </w:r>
+            <w:r>
+              <w:rPr>
+                <w:lang w:val="ru-RU"/>
+              </w:rPr>
+              <w:t xml:space="preserve"> </w:t>
+            </w:r>
+            <w:r>
+              <w:t> </w:t>
+            </w:r>
+            <w:r>
+              <w:rPr>
+                <w:lang w:val="ru-RU"/>
+              </w:rPr>
+              <w:t xml:space="preserve"> </w:t>
+            </w:r>
+            <w:r>
+              <w:t> </w:t>
+            </w:r>
+            <w:r>
+              <w:rPr>
+                <w:lang w:val="ru-RU"/>
+              </w:rPr>
+              <w:t xml:space="preserve"> </w:t>
+            </w:r>
+            <w:r>
+              <w:t> </w:t>
+            </w:r>
+            <w:r>
+              <w:rPr>
+                <w:lang w:val="ru-RU"/>
+              </w:rPr>
+              <w:t xml:space="preserve"> </w:t>
+            </w:r>
+            <w:r>
+              <w:t> </w:t>
+            </w:r>
+            <w:r>
+              <w:rPr>
+                <w:lang w:val="ru-RU"/>
+              </w:rPr>
+              <w:t xml:space="preserve"> </w:t>
+            </w:r>
+            <w:r>
+              <w:t> </w:t>
+            </w:r>
+            <w:r>
+              <w:rPr>
+                <w:lang w:val="ru-RU"/>
+              </w:rPr>
+              <w:t xml:space="preserve"> </w:t>
+            </w:r>
+            <w:r>
+              <w:t>break</w:t>
+            </w:r>
+          </w:p>
+          <w:p>
+            <w:pPr>
+              <w:pStyle w:val="af2"/>
+            </w:pPr>
+          </w:p>
+        </w:tc>
+      </w:tr>
+    </w:tbl>
+    <w:p>
+      <w:pPr>
+        <w:pStyle w:val="af2"/>
+      </w:pPr>
+    </w:p>
+    <w:p>
+      <w:pPr>
+        <w:pStyle w:val="af2"/>
+        <w:pPrChange w:id="8" w:author="Vasy Medov" w:date="2026-02-19T17:43:00Z">
+          <w:pPr>
+            <w:pStyle w:val="10"/>
+          </w:pPr>
+        </w:pPrChange>
+      </w:pPr>
     </w:p>
     <w:p>
       <w:r>
@@ -1331,36 +2634,20 @@
           <w:t>Код вычислительного метода</w:t>
         </w:r>
       </w:hyperlink>
+      <w:bookmarkStart w:id="9" w:name="_Toc182062728"/>
+    </w:p>
+    <w:p>
+      <w:pPr>
+        <w:pStyle w:val="10"/>
+      </w:pPr>
     </w:p>
     <w:p/>
-    <w:p>
-      <w:pPr>
-        <w:pStyle w:val="10"/>
-        <w:rPr>
-          <w:lang w:val="en-US"/>
-        </w:rPr>
-      </w:pPr>
-      <w:bookmarkStart w:id="7" w:name="_Toc182062728"/>
-    </w:p>
-    <w:p>
-      <w:pPr>
-        <w:pStyle w:val="10"/>
-        <w:rPr>
-          <w:lang w:val="en-US"/>
-        </w:rPr>
-      </w:pPr>
-    </w:p>
-    <w:p>
-      <w:pPr>
-        <w:pStyle w:val="10"/>
-        <w:rPr>
-          <w:lang w:val="en-US"/>
-        </w:rPr>
-      </w:pPr>
-    </w:p>
-    <w:p>
-      <w:pPr>
-        <w:pStyle w:val="10"/>
+    <w:p/>
+    <w:p/>
+    <w:p/>
+    <w:p/>
+    <w:p>
+      <w:pPr>
         <w:rPr>
           <w:lang w:val="en-US"/>
         </w:rPr>
@@ -1374,7 +2661,7 @@
         <w:lastRenderedPageBreak/>
         <w:t>Результат работы</w:t>
       </w:r>
-      <w:bookmarkEnd w:id="7"/>
+      <w:bookmarkEnd w:id="9"/>
     </w:p>
     <w:p>
       <w:pPr>
@@ -1390,6 +2677,7 @@
       <w:r>
         <w:rPr>
           <w:rFonts w:ascii="Courier New" w:eastAsia="Times New Roman" w:hAnsi="Courier New" w:cs="Courier New"/>
+          <w:noProof/>
           <w:color w:val="303570"/>
           <w:sz w:val="20"/>
           <w:szCs w:val="20"/>
@@ -1434,6 +2722,7 @@
       <w:r>
         <w:rPr>
           <w:rFonts w:ascii="Courier New" w:eastAsia="Times New Roman" w:hAnsi="Courier New" w:cs="Courier New"/>
+          <w:noProof/>
           <w:color w:val="303570"/>
           <w:sz w:val="20"/>
           <w:szCs w:val="20"/>
@@ -1484,7 +2773,7 @@
           <w:lang w:val="en-US"/>
         </w:rPr>
       </w:pPr>
-      <w:bookmarkStart w:id="8" w:name="_Toc182062729"/>
+      <w:bookmarkStart w:id="10" w:name="_Toc182062729"/>
     </w:p>
     <w:p>
       <w:pPr>
@@ -1493,7 +2782,7 @@
       <w:r>
         <w:t>Вывод</w:t>
       </w:r>
-      <w:bookmarkEnd w:id="8"/>
+      <w:bookmarkEnd w:id="10"/>
     </w:p>
     <w:p>
       <w:r>
@@ -1539,7 +2828,12 @@
         <w:ind w:left="0" w:firstLine="0"/>
         <w:rPr>
           <w:noProof/>
-          <w:lang w:val="en-US"/>
+          <w:rPrChange w:id="11" w:author="Vasy Medov" w:date="2026-02-19T00:03:00Z">
+            <w:rPr>
+              <w:noProof/>
+              <w:lang w:val="en-US"/>
+            </w:rPr>
+          </w:rPrChange>
         </w:rPr>
       </w:pPr>
     </w:p>
@@ -1551,7 +2845,7 @@
         <w:rPr>
           <w:lang w:val="en-US"/>
         </w:rPr>
-        <w:pPrChange w:id="9" w:author="Vasy Medov" w:date="2026-02-18T21:23:00Z">
+        <w:pPrChange w:id="12" w:author="Vasy Medov" w:date="2026-02-18T21:23:00Z">
           <w:pPr>
             <w:pStyle w:val="ad"/>
             <w:ind w:left="0" w:firstLine="0"/>
@@ -1563,7 +2857,7 @@
           <w:noProof/>
         </w:rPr>
         <w:drawing>
-          <wp:inline distT="0" distB="0" distL="0" distR="0" wp14:anchorId="3350B4AD" wp14:editId="3CE43127">
+          <wp:inline distT="0" distB="0" distL="0" distR="0" wp14:anchorId="3350B4AD" wp14:editId="0C13D920">
             <wp:extent cx="1883583" cy="1905532"/>
             <wp:effectExtent l="0" t="0" r="2540" b="0"/>
             <wp:docPr id="7" name="Рисунок 7"/>
@@ -3534,7 +4828,6 @@
   <w:style w:type="character" w:default="1" w:styleId="a1">
     <w:name w:val="Default Paragraph Font"/>
     <w:uiPriority w:val="1"/>
-    <w:semiHidden/>
     <w:unhideWhenUsed/>
   </w:style>
   <w:style w:type="table" w:default="1" w:styleId="a2">
@@ -3916,6 +5209,33 @@
       <w:szCs w:val="24"/>
     </w:rPr>
   </w:style>
+  <w:style w:type="paragraph" w:customStyle="1" w:styleId="af2">
+    <w:name w:val="Код"/>
+    <w:basedOn w:val="a0"/>
+    <w:link w:val="af3"/>
+    <w:qFormat/>
+    <w:rsid w:val="00571C7F"/>
+    <w:pPr>
+      <w:spacing w:after="0" w:line="240" w:lineRule="auto"/>
+    </w:pPr>
+    <w:rPr>
+      <w:color w:val="833C0B" w:themeColor="accent2" w:themeShade="80"/>
+      <w:sz w:val="24"/>
+      <w:lang w:val="en-US"/>
+    </w:rPr>
+  </w:style>
+  <w:style w:type="character" w:customStyle="1" w:styleId="af3">
+    <w:name w:val="Код Знак"/>
+    <w:basedOn w:val="a1"/>
+    <w:link w:val="af2"/>
+    <w:rsid w:val="00571C7F"/>
+    <w:rPr>
+      <w:rFonts w:ascii="Times New Roman" w:hAnsi="Times New Roman"/>
+      <w:color w:val="833C0B" w:themeColor="accent2" w:themeShade="80"/>
+      <w:sz w:val="24"/>
+      <w:lang w:val="en-US"/>
+    </w:rPr>
+  </w:style>
 </w:styles>
 </file>
 

</xml_diff>